<commit_message>
correct macOS installation manual
</commit_message>
<xml_diff>
--- a/installer/macos/READ ME Installation Guide.docx
+++ b/installer/macos/READ ME Installation Guide.docx
@@ -36,6 +36,7 @@
           <w:szCs w:val="20"/>
         </w:rPr>
       </w:pPr>
+      <w:proofErr w:type="spellStart"/>
       <w:r>
         <w:rPr>
           <w:rFonts w:cstheme="minorHAnsi"/>
@@ -43,7 +44,17 @@
           <w:sz w:val="20"/>
           <w:szCs w:val="20"/>
         </w:rPr>
-        <w:t>TempicoSoftware – macOS Installation Guide</w:t>
+        <w:t>TempicoSoftware</w:t>
+      </w:r>
+      <w:proofErr w:type="spellEnd"/>
+      <w:r>
+        <w:rPr>
+          <w:rFonts w:cstheme="minorHAnsi"/>
+          <w:color w:val="808080" w:themeColor="background1" w:themeShade="80"/>
+          <w:sz w:val="20"/>
+          <w:szCs w:val="20"/>
+        </w:rPr>
+        <w:t xml:space="preserve"> – macOS Installation Guide</w:t>
       </w:r>
     </w:p>
     <w:p>
@@ -118,7 +129,7 @@
           <w:sz w:val="22"/>
           <w:szCs w:val="22"/>
         </w:rPr>
-        <w:t>Double-click the downloaded fi</w:t>
+        <w:t>Double-click the downloaded file to extract its contents into a new folder</w:t>
       </w:r>
       <w:r>
         <w:rPr>
@@ -126,44 +137,70 @@
           <w:sz w:val="22"/>
           <w:szCs w:val="22"/>
         </w:rPr>
-        <w:t>le to extract its contents into a new folder</w:t>
-      </w:r>
+        <w:t xml:space="preserve">. Inside, you’ll find three items: the </w:t>
+      </w:r>
+      <w:proofErr w:type="spellStart"/>
       <w:r>
         <w:rPr>
           <w:rFonts w:cstheme="minorHAnsi"/>
           <w:sz w:val="22"/>
           <w:szCs w:val="22"/>
         </w:rPr>
-        <w:t>. Inside, you’ll find three items: the TempicoSoftware application, the installer script (</w:t>
-      </w:r>
-      <w:r>
-        <w:t>“</w:t>
-      </w:r>
-      <w:r>
-        <w:t>Install</w:t>
-      </w:r>
-      <w:r>
-        <w:t xml:space="preserve"> </w:t>
-      </w:r>
-      <w:r>
-        <w:t>TempicoSoftware.command</w:t>
-      </w:r>
-      <w:r>
-        <w:t>”), and this guide.</w:t>
-      </w:r>
-    </w:p>
-    <w:p>
-      <w:pPr>
-        <w:spacing w:line="276" w:lineRule="auto"/>
+        <w:t>TempicoSoftware</w:t>
+      </w:r>
+      <w:proofErr w:type="spellEnd"/>
+      <w:r>
         <w:rPr>
           <w:rFonts w:cstheme="minorHAnsi"/>
           <w:sz w:val="22"/>
           <w:szCs w:val="22"/>
         </w:rPr>
-      </w:pPr>
-      <w:r>
+        <w:t xml:space="preserve"> application, the installer script (</w:t>
+      </w:r>
+      <w:r>
+        <w:rPr>
+          <w:sz w:val="22"/>
+          <w:szCs w:val="22"/>
+        </w:rPr>
+        <w:t>“Install</w:t>
+      </w:r>
+      <w:r>
+        <w:rPr>
+          <w:sz w:val="22"/>
+          <w:szCs w:val="22"/>
+        </w:rPr>
+        <w:t xml:space="preserve"> </w:t>
+      </w:r>
+      <w:proofErr w:type="spellStart"/>
+      <w:r>
+        <w:rPr>
+          <w:sz w:val="22"/>
+          <w:szCs w:val="22"/>
+        </w:rPr>
+        <w:t>TempicoSoftware.command</w:t>
+      </w:r>
+      <w:proofErr w:type="spellEnd"/>
+      <w:r>
+        <w:rPr>
+          <w:sz w:val="22"/>
+          <w:szCs w:val="22"/>
+        </w:rPr>
+        <w:t>”), and this guide.</w:t>
+      </w:r>
+    </w:p>
+    <w:p>
+      <w:pPr>
+        <w:spacing w:line="276" w:lineRule="auto"/>
         <w:rPr>
           <w:rFonts w:cstheme="minorHAnsi"/>
+          <w:sz w:val="22"/>
+          <w:szCs w:val="22"/>
+        </w:rPr>
+      </w:pPr>
+      <w:r>
+        <w:rPr>
+          <w:rFonts w:cstheme="minorHAnsi"/>
+          <w:noProof/>
           <w:sz w:val="22"/>
           <w:szCs w:val="22"/>
         </w:rPr>
@@ -513,12 +550,36 @@
           <w:shd w:val="clear" w:color="auto" w:fill="000000" w:themeFill="text1"/>
         </w:rPr>
       </w:pPr>
+      <w:proofErr w:type="spellStart"/>
       <w:r>
         <w:rPr>
           <w:shd w:val="clear" w:color="auto" w:fill="000000" w:themeFill="text1"/>
         </w:rPr>
-        <w:t>xattr -d com.apple.quarantine</w:t>
-      </w:r>
+        <w:t>xattr</w:t>
+      </w:r>
+      <w:proofErr w:type="spellEnd"/>
+      <w:r>
+        <w:rPr>
+          <w:shd w:val="clear" w:color="auto" w:fill="000000" w:themeFill="text1"/>
+        </w:rPr>
+        <w:t xml:space="preserve"> -d </w:t>
+      </w:r>
+      <w:proofErr w:type="spellStart"/>
+      <w:proofErr w:type="gramStart"/>
+      <w:r>
+        <w:rPr>
+          <w:shd w:val="clear" w:color="auto" w:fill="000000" w:themeFill="text1"/>
+        </w:rPr>
+        <w:t>com.apple</w:t>
+      </w:r>
+      <w:proofErr w:type="gramEnd"/>
+      <w:r>
+        <w:rPr>
+          <w:shd w:val="clear" w:color="auto" w:fill="000000" w:themeFill="text1"/>
+        </w:rPr>
+        <w:t>.quarantine</w:t>
+      </w:r>
+      <w:proofErr w:type="spellEnd"/>
       <w:r>
         <w:rPr>
           <w:shd w:val="clear" w:color="auto" w:fill="000000" w:themeFill="text1"/>
@@ -591,8 +652,13 @@
         <w:t>With the command line still selected, drag the “</w:t>
       </w:r>
       <w:r>
-        <w:t>Install TempicoSoftware.command</w:t>
-      </w:r>
+        <w:t xml:space="preserve">Install </w:t>
+      </w:r>
+      <w:proofErr w:type="spellStart"/>
+      <w:r>
+        <w:t>TempicoSoftware.command</w:t>
+      </w:r>
+      <w:proofErr w:type="spellEnd"/>
       <w:r>
         <w:t xml:space="preserve">” file from the unzipped folder into the Terminal window, right after the command. This automatically fills in the correct file path </w:t>
       </w:r>
@@ -742,8 +808,9 @@
           <w:sz w:val="20"/>
           <w:szCs w:val="20"/>
         </w:rPr>
-        <w:t>: On some machines, Terminal may respond with “No such xattr: com.apple.quarantine”</w:t>
-      </w:r>
+        <w:t xml:space="preserve">: On some machines, Terminal may respond with “No such </w:t>
+      </w:r>
+      <w:proofErr w:type="spellStart"/>
       <w:r>
         <w:rPr>
           <w:rFonts w:cstheme="minorHAnsi"/>
@@ -753,8 +820,9 @@
           <w:sz w:val="20"/>
           <w:szCs w:val="20"/>
         </w:rPr>
-        <w:t xml:space="preserve"> </w:t>
-      </w:r>
+        <w:t>xattr</w:t>
+      </w:r>
+      <w:proofErr w:type="spellEnd"/>
       <w:r>
         <w:rPr>
           <w:rFonts w:cstheme="minorHAnsi"/>
@@ -764,6 +832,65 @@
           <w:sz w:val="20"/>
           <w:szCs w:val="20"/>
         </w:rPr>
+        <w:t xml:space="preserve">: </w:t>
+      </w:r>
+      <w:proofErr w:type="spellStart"/>
+      <w:proofErr w:type="gramStart"/>
+      <w:r>
+        <w:rPr>
+          <w:rFonts w:cstheme="minorHAnsi"/>
+          <w:i/>
+          <w:iCs/>
+          <w:color w:val="808080" w:themeColor="background1" w:themeShade="80"/>
+          <w:sz w:val="20"/>
+          <w:szCs w:val="20"/>
+        </w:rPr>
+        <w:t>com.apple</w:t>
+      </w:r>
+      <w:proofErr w:type="gramEnd"/>
+      <w:r>
+        <w:rPr>
+          <w:rFonts w:cstheme="minorHAnsi"/>
+          <w:i/>
+          <w:iCs/>
+          <w:color w:val="808080" w:themeColor="background1" w:themeShade="80"/>
+          <w:sz w:val="20"/>
+          <w:szCs w:val="20"/>
+        </w:rPr>
+        <w:t>.quarantine</w:t>
+      </w:r>
+      <w:proofErr w:type="spellEnd"/>
+      <w:r>
+        <w:rPr>
+          <w:rFonts w:cstheme="minorHAnsi"/>
+          <w:i/>
+          <w:iCs/>
+          <w:color w:val="808080" w:themeColor="background1" w:themeShade="80"/>
+          <w:sz w:val="20"/>
+          <w:szCs w:val="20"/>
+        </w:rPr>
+        <w:t>”</w:t>
+      </w:r>
+      <w:r>
+        <w:rPr>
+          <w:rFonts w:cstheme="minorHAnsi"/>
+          <w:i/>
+          <w:iCs/>
+          <w:color w:val="808080" w:themeColor="background1" w:themeShade="80"/>
+          <w:sz w:val="20"/>
+          <w:szCs w:val="20"/>
+        </w:rPr>
+        <w:t xml:space="preserve"> </w:t>
+      </w:r>
+      <w:r>
+        <w:rPr>
+          <w:rFonts w:cstheme="minorHAnsi"/>
+          <w:i/>
+          <w:iCs/>
+          <w:color w:val="808080" w:themeColor="background1" w:themeShade="80"/>
+          <w:sz w:val="20"/>
+          <w:szCs w:val="20"/>
+        </w:rPr>
         <w:t>This is not an error — it simply means that particular Mac’s security settings didn’t flag the file with the quarantine attribute in the first place, so there was nothing to remove. It’s safe to continue to the next step regardless.</w:t>
       </w:r>
     </w:p>
@@ -811,7 +938,15 @@
         <w:t xml:space="preserve">Return to the unzipped folder and double-click </w:t>
       </w:r>
       <w:r>
-        <w:t>“Install TempicoSoftware.command”</w:t>
+        <w:t xml:space="preserve">“Install </w:t>
+      </w:r>
+      <w:proofErr w:type="spellStart"/>
+      <w:r>
+        <w:t>TempicoSoftware.command</w:t>
+      </w:r>
+      <w:proofErr w:type="spellEnd"/>
+      <w:r>
+        <w:t>”</w:t>
       </w:r>
       <w:r>
         <w:t>.</w:t>
@@ -822,6 +957,9 @@
         <w:spacing w:line="276" w:lineRule="auto"/>
       </w:pPr>
       <w:r>
+        <w:rPr>
+          <w:noProof/>
+        </w:rPr>
         <w:drawing>
           <wp:inline distT="0" distB="0" distL="0" distR="0" wp14:anchorId="33CBAC11" wp14:editId="2794E8FC">
             <wp:extent cx="5249008" cy="1438476"/>
@@ -877,7 +1015,31 @@
           <w:sz w:val="20"/>
           <w:szCs w:val="20"/>
         </w:rPr>
-        <w:t>Note: if macOS shows a security warning at this point, go to System Settings → Privacy &amp; Security, scroll to the Security section, and click “Open Anyway” next to the TempicoSoftware entry.</w:t>
+        <w:t xml:space="preserve">Note: if macOS shows a security warning at this point, go to System Settings → Privacy &amp; Security, scroll to the Security section, and click “Open Anyway” next to the </w:t>
+      </w:r>
+      <w:proofErr w:type="spellStart"/>
+      <w:r>
+        <w:rPr>
+          <w:rFonts w:cstheme="minorHAnsi"/>
+          <w:i/>
+          <w:iCs/>
+          <w:color w:val="808080" w:themeColor="background1" w:themeShade="80"/>
+          <w:sz w:val="20"/>
+          <w:szCs w:val="20"/>
+        </w:rPr>
+        <w:t>TempicoSoftware</w:t>
+      </w:r>
+      <w:proofErr w:type="spellEnd"/>
+      <w:r>
+        <w:rPr>
+          <w:rFonts w:cstheme="minorHAnsi"/>
+          <w:i/>
+          <w:iCs/>
+          <w:color w:val="808080" w:themeColor="background1" w:themeShade="80"/>
+          <w:sz w:val="20"/>
+          <w:szCs w:val="20"/>
+        </w:rPr>
+        <w:t xml:space="preserve"> entry.</w:t>
       </w:r>
     </w:p>
     <w:p>
@@ -919,8 +1081,13 @@
       <w:pPr>
         <w:spacing w:line="276" w:lineRule="auto"/>
       </w:pPr>
-      <w:r>
-        <w:t xml:space="preserve">TempicoSoftware will install into the Applications folder and open automatically. </w:t>
+      <w:proofErr w:type="spellStart"/>
+      <w:r>
+        <w:t>TempicoSoftware</w:t>
+      </w:r>
+      <w:proofErr w:type="spellEnd"/>
+      <w:r>
+        <w:t xml:space="preserve"> will install into the Applications folder and open automatically. </w:t>
       </w:r>
       <w:r>
         <w:t>The installer file will remove itself once installation is complete,</w:t>
@@ -933,7 +1100,15 @@
       </w:r>
       <w:r>
         <w:softHyphen/>
-        <w:t>— TempicoSoftware is now available from Applications or Spotlight, and will open normally from now on.</w:t>
+        <w:t xml:space="preserve">— </w:t>
+      </w:r>
+      <w:proofErr w:type="spellStart"/>
+      <w:r>
+        <w:t>TempicoSoftware</w:t>
+      </w:r>
+      <w:proofErr w:type="spellEnd"/>
+      <w:r>
+        <w:t xml:space="preserve"> is now available from Applications or Spotlight, and will open normally from now on.</w:t>
       </w:r>
     </w:p>
     <w:p>
@@ -3908,6 +4083,23 @@
 </file>
 
 <file path=customXml/item1.xml><?xml version="1.0" encoding="utf-8"?>
+<p:properties xmlns:p="http://schemas.microsoft.com/office/2006/metadata/properties" xmlns:xsi="http://www.w3.org/2001/XMLSchema-instance" xmlns:pc="http://schemas.microsoft.com/office/infopath/2007/PartnerControls">
+  <documentManagement>
+    <_activity xmlns="25ac7f3b-e7ce-49fd-a987-fa8976d97dfb" xsi:nil="true"/>
+  </documentManagement>
+</p:properties>
+</file>
+
+<file path=customXml/item2.xml><?xml version="1.0" encoding="utf-8"?>
+<?mso-contentType ?>
+<FormTemplates xmlns="http://schemas.microsoft.com/sharepoint/v3/contenttype/forms">
+  <Display>DocumentLibraryForm</Display>
+  <Edit>DocumentLibraryForm</Edit>
+  <New>DocumentLibraryForm</New>
+</FormTemplates>
+</file>
+
+<file path=customXml/item3.xml><?xml version="1.0" encoding="utf-8"?>
 <ct:contentTypeSchema xmlns:ct="http://schemas.microsoft.com/office/2006/metadata/contentType" xmlns:ma="http://schemas.microsoft.com/office/2006/metadata/properties/metaAttributes" ct:_="" ma:_="" ma:contentTypeName="Documento" ma:contentTypeID="0x01010028078C1669280341BBFA4DDBF5DEE440" ma:contentTypeVersion="17" ma:contentTypeDescription="Crear nuevo documento." ma:contentTypeScope="" ma:versionID="c3cb02910313abac48a3623eca6edbff">
   <xsd:schema xmlns:xsd="http://www.w3.org/2001/XMLSchema" xmlns:xs="http://www.w3.org/2001/XMLSchema" xmlns:p="http://schemas.microsoft.com/office/2006/metadata/properties" xmlns:ns3="25ac7f3b-e7ce-49fd-a987-fa8976d97dfb" xmlns:ns4="04019aa6-0c12-4ed1-aa90-93e5e88a09e1" targetNamespace="http://schemas.microsoft.com/office/2006/metadata/properties" ma:root="true" ma:fieldsID="1c75b605c64bee732596cb1192604de9" ns3:_="" ns4:_="">
     <xsd:import namespace="25ac7f3b-e7ce-49fd-a987-fa8976d97dfb"/>
@@ -4154,24 +4346,25 @@
 </ct:contentTypeSchema>
 </file>
 
-<file path=customXml/item2.xml><?xml version="1.0" encoding="utf-8"?>
-<?mso-contentType ?>
-<FormTemplates xmlns="http://schemas.microsoft.com/sharepoint/v3/contenttype/forms">
-  <Display>DocumentLibraryForm</Display>
-  <Edit>DocumentLibraryForm</Edit>
-  <New>DocumentLibraryForm</New>
-</FormTemplates>
+<file path=customXml/itemProps1.xml><?xml version="1.0" encoding="utf-8"?>
+<ds:datastoreItem xmlns:ds="http://schemas.openxmlformats.org/officeDocument/2006/customXml" ds:itemID="{37920062-DECF-4E5F-A991-39AD66558BFF}">
+  <ds:schemaRefs>
+    <ds:schemaRef ds:uri="http://schemas.microsoft.com/office/2006/metadata/properties"/>
+    <ds:schemaRef ds:uri="http://schemas.microsoft.com/office/infopath/2007/PartnerControls"/>
+    <ds:schemaRef ds:uri="25ac7f3b-e7ce-49fd-a987-fa8976d97dfb"/>
+  </ds:schemaRefs>
+</ds:datastoreItem>
 </file>
 
-<file path=customXml/item3.xml><?xml version="1.0" encoding="utf-8"?>
-<p:properties xmlns:p="http://schemas.microsoft.com/office/2006/metadata/properties" xmlns:xsi="http://www.w3.org/2001/XMLSchema-instance" xmlns:pc="http://schemas.microsoft.com/office/infopath/2007/PartnerControls">
-  <documentManagement>
-    <_activity xmlns="25ac7f3b-e7ce-49fd-a987-fa8976d97dfb" xsi:nil="true"/>
-  </documentManagement>
-</p:properties>
+<file path=customXml/itemProps2.xml><?xml version="1.0" encoding="utf-8"?>
+<ds:datastoreItem xmlns:ds="http://schemas.openxmlformats.org/officeDocument/2006/customXml" ds:itemID="{16FBDDC9-B6A4-4FD0-A1C5-958614A1FA7D}">
+  <ds:schemaRefs>
+    <ds:schemaRef ds:uri="http://schemas.microsoft.com/sharepoint/v3/contenttype/forms"/>
+  </ds:schemaRefs>
+</ds:datastoreItem>
 </file>
 
-<file path=customXml/itemProps1.xml><?xml version="1.0" encoding="utf-8"?>
+<file path=customXml/itemProps3.xml><?xml version="1.0" encoding="utf-8"?>
 <ds:datastoreItem xmlns:ds="http://schemas.openxmlformats.org/officeDocument/2006/customXml" ds:itemID="{22621B40-ED0F-415B-A92D-77511434B474}">
   <ds:schemaRefs>
     <ds:schemaRef ds:uri="http://schemas.microsoft.com/office/2006/metadata/contentType"/>
@@ -4188,22 +4381,4 @@
     <ds:schemaRef ds:uri="http://schemas.microsoft.com/internal/obd"/>
   </ds:schemaRefs>
 </ds:datastoreItem>
-</file>
-
-<file path=customXml/itemProps2.xml><?xml version="1.0" encoding="utf-8"?>
-<ds:datastoreItem xmlns:ds="http://schemas.openxmlformats.org/officeDocument/2006/customXml" ds:itemID="{16FBDDC9-B6A4-4FD0-A1C5-958614A1FA7D}">
-  <ds:schemaRefs>
-    <ds:schemaRef ds:uri="http://schemas.microsoft.com/sharepoint/v3/contenttype/forms"/>
-  </ds:schemaRefs>
-</ds:datastoreItem>
-</file>
-
-<file path=customXml/itemProps3.xml><?xml version="1.0" encoding="utf-8"?>
-<ds:datastoreItem xmlns:ds="http://schemas.openxmlformats.org/officeDocument/2006/customXml" ds:itemID="{37920062-DECF-4E5F-A991-39AD66558BFF}">
-  <ds:schemaRefs>
-    <ds:schemaRef ds:uri="http://schemas.microsoft.com/office/2006/metadata/properties"/>
-    <ds:schemaRef ds:uri="http://schemas.microsoft.com/office/infopath/2007/PartnerControls"/>
-    <ds:schemaRef ds:uri="25ac7f3b-e7ce-49fd-a987-fa8976d97dfb"/>
-  </ds:schemaRefs>
-</ds:datastoreItem>
 </file>
</xml_diff>